<commit_message>
Add in-text citations throughout Assignment_2C_final.docx
https://claude.ai/code/session_01YMeGpkxrPYFqX6acqjcPet
</commit_message>
<xml_diff>
--- a/Assignment_2C_final.docx
+++ b/Assignment_2C_final.docx
@@ -12,144 +12,58 @@
     </w:p>
     <w:p>
       <w:r>
-        <w:t xml:space="preserve">The </w:t>
-      </w:r>
-      <w:r>
-        <w:t xml:space="preserve">Traffic Based Route Guidance System and a proposed </w:t>
-      </w:r>
-      <w:r>
-        <w:t>Traffic Based Route Guidance System+</w:t>
-      </w:r>
-      <w:r>
-        <w:t>,</w:t>
-      </w:r>
-      <w:r>
-        <w:t xml:space="preserve"> present several significant ethical issues related to algorithm selections, data quality and user privacy. The use of multiple search algorithms inc</w:t>
-      </w:r>
-      <w:r>
-        <w:t>luding Breadth First Search, Depth First Search and Greedy Best First Searc</w:t>
-      </w:r>
-      <w:r>
-        <w:t>h introduce concerns regarding accuracy and user expectations as these methods do not always pro</w:t>
-      </w:r>
-      <w:r>
-        <w:t xml:space="preserve">duce optimal routes. </w:t>
-      </w:r>
-      <w:r>
-        <w:t>Additionally,</w:t>
-      </w:r>
-      <w:r>
-        <w:t xml:space="preserve"> the application </w:t>
-      </w:r>
-      <w:r>
-        <w:t>relies</w:t>
-      </w:r>
-      <w:r>
-        <w:t xml:space="preserve"> on outdated traffic data from 2006 and simplified modelling assumptions such as </w:t>
-      </w:r>
-      <w:r>
-        <w:t xml:space="preserve">fixed constants of speed limit and </w:t>
-      </w:r>
-      <w:r>
-        <w:t xml:space="preserve">intersection delays, which reduce reliability of travel time predictions. </w:t>
-      </w:r>
-      <w:r>
-        <w:t xml:space="preserve">The proposed mobile version of the application, </w:t>
-      </w:r>
-      <w:r>
-        <w:t>Traffic Based Route Guidance System</w:t>
-      </w:r>
-      <w:r>
-        <w:t xml:space="preserve">+, </w:t>
-      </w:r>
-      <w:r>
-        <w:t xml:space="preserve">raises further ethical concerns regarding the collection and handling of sensitive location data, which can expose personal </w:t>
-      </w:r>
-      <w:r>
-        <w:t>behaviours and create risks related to data misuse or breaches.</w:t>
-      </w:r>
-    </w:p>
-    <w:p>
-      <w:r>
-        <w:t>The analysis concludes th</w:t>
-      </w:r>
-      <w:r>
-        <w:t>at</w:t>
-      </w:r>
-      <w:r>
-        <w:t xml:space="preserve"> </w:t>
-      </w:r>
+        <w:t>The Traffic Based Route Guidance System and a proposed Traffic Based Route Guidance System+, present several significant ethical issues related to algorithm selections, data quality and user privacy. The use of multiple search algorithms including Breadth First Search, Depth First Search and Greedy Best First Search introduce concerns regarding accuracy and user expectations as these methods do not always produce optimal routes. Additionally, the application relies on outdated traffic data from 2006 and simplified modelling assumptions such as fixed constants of speed limit and intersection delays, which reduce reliability of travel time predictions (Floridi et al., 2018). The proposed mobile version of the application, Traffic Based Route Guidance System+, raises further ethical concerns regarding the collection and handling of sensitive location data, which can expose personal behaviours and create risks related to data misuse or breaches (Zuboff, 2019).</w:t>
+      </w:r>
+      <w:r/>
+      <w:r/>
+      <w:r/>
+      <w:r/>
+      <w:r/>
+      <w:r/>
+      <w:r/>
+      <w:r/>
+      <w:r/>
+      <w:r/>
+      <w:r/>
+      <w:r/>
+      <w:r/>
+      <w:r/>
+      <w:r/>
+      <w:r/>
+      <w:r/>
+      <w:r/>
+    </w:p>
+    <w:p>
+      <w:r>
+        <w:t>The analysis concludes that these issues can undermine user trust and lead to wrongly informed decision making if not addressed. It is recommended that TBRGS prioritise cost aware algorithms such as A* and Dijkstra, improve transparency by communicating application limits and assumptions and enhance data quality through updated data sets and dynamic variables. For the mobile version of the application, a privacy first approach should be adopted, including minimal data collection, opt in consent mechanisms and secure data handling practices to ensure compliance with relevant privacy regulations (Office of the Australian Information Commissioner, 2023). Overall, the prioritisation of accuracy, transparency and user privacy will enable the application to operate ethically while improving user reliability and confidence.</w:t>
+      </w:r>
+      <w:r/>
+      <w:r/>
       <w:proofErr w:type="gramStart"/>
-      <w:r>
-        <w:t>these issue</w:t>
-      </w:r>
+      <w:r/>
       <w:proofErr w:type="gramEnd"/>
-      <w:r>
-        <w:t xml:space="preserve"> can undermine user trust and lead to </w:t>
-      </w:r>
-      <w:r>
-        <w:t>wrongly informed</w:t>
-      </w:r>
-      <w:r>
-        <w:t xml:space="preserve"> de</w:t>
-      </w:r>
-      <w:r>
-        <w:t xml:space="preserve">cision making if not addressed. </w:t>
-      </w:r>
-      <w:r>
-        <w:t>I</w:t>
-      </w:r>
-      <w:r>
-        <w:t>t is recommended that TBRGS prio</w:t>
-      </w:r>
-      <w:r>
-        <w:t xml:space="preserve">ritise cost aware algorithms such as A* and Dijkstra, improve </w:t>
-      </w:r>
-      <w:r>
-        <w:t>transparency</w:t>
-      </w:r>
-      <w:r>
-        <w:t xml:space="preserve"> by communicating </w:t>
-      </w:r>
-      <w:r>
-        <w:t xml:space="preserve">application limits and </w:t>
-      </w:r>
-      <w:r>
-        <w:t>assumptions</w:t>
-      </w:r>
-      <w:r>
-        <w:t xml:space="preserve"> and </w:t>
-      </w:r>
-      <w:r>
-        <w:t>enhance</w:t>
-      </w:r>
-      <w:r>
-        <w:t xml:space="preserve"> data quality th</w:t>
-      </w:r>
-      <w:r>
-        <w:t>r</w:t>
-      </w:r>
-      <w:r>
-        <w:t xml:space="preserve">ough updated data sets and dynamic variables. </w:t>
-      </w:r>
-      <w:r>
-        <w:t xml:space="preserve">For the </w:t>
-      </w:r>
-      <w:r>
-        <w:t>mobile version of the application</w:t>
-      </w:r>
-      <w:r>
-        <w:t xml:space="preserve">, a privacy first approach should be adopted, including minimal data collection, opt in consent mechanisms and </w:t>
-      </w:r>
-      <w:r>
-        <w:t>secure data handling practices to ensure compliance with relevant privacy regulations. Overall</w:t>
-      </w:r>
-      <w:r>
-        <w:t xml:space="preserve">, the prioritisation of accuracy, transparency and user privacy will enable the application to operate </w:t>
-      </w:r>
-      <w:r>
-        <w:t>ethically while improving user reliability and confidence.</w:t>
-      </w:r>
+      <w:r/>
+      <w:r/>
+      <w:r/>
+      <w:r/>
+      <w:r/>
+      <w:r/>
+      <w:r/>
+      <w:r/>
+      <w:r/>
+      <w:r/>
+      <w:r/>
+      <w:r/>
+      <w:r/>
+      <w:r/>
+      <w:r/>
+      <w:r/>
+      <w:r/>
+      <w:r/>
+      <w:r/>
+      <w:r/>
+      <w:r/>
+      <w:r/>
     </w:p>
     <w:p>
       <w:pPr>
@@ -365,322 +279,248 @@
     </w:p>
     <w:p>
       <w:r>
-        <w:t xml:space="preserve">The inclusion of these algorithms raises ethical concerns related to </w:t>
-      </w:r>
-      <w:r>
-        <w:t xml:space="preserve">accuracy and user expectations. Users of a navigation </w:t>
+        <w:t>The inclusion of these algorithms raises ethical concerns related to accuracy and user expectations. Australia's AI Ethics Principles state that AI systems should be transparent and explainable so that users can understand and contest outcomes (Department of Industry, Science and Resources, 2024). Users of a navigation application assume that the recommended route is the most efficient or optimal, however when algorithms like DFS, BFS and GBFS are used the resulting route may be suboptimal due to the searches properties.</w:t>
+      </w:r>
+      <w:r/>
+      <w:r/>
+      <w:r/>
+      <w:r/>
+      <w:r/>
+      <w:r/>
+      <w:r/>
+      <w:r/>
+      <w:proofErr w:type="gramStart"/>
+      <w:r/>
+      <w:proofErr w:type="gramEnd"/>
+      <w:r/>
+      <w:r/>
+    </w:p>
+    <w:p>
+      <w:r>
+        <w:t>Following this line of thought, ethical concerns lies within the selection of the heuristic functions. The current system uses the straight line distance between intersections as a heuristic. While functional and accurate for straight roads, it suffers under curved roads or the sparse amount of intersections we have to work with. Floridi et al. (2018) identify non-maleficence as a core AI ethics principle — a system whose heuristic systematically produces suboptimal routes risks actively misleading users.</w:t>
+      </w:r>
+      <w:r/>
+      <w:r/>
+      <w:proofErr w:type="gramStart"/>
+      <w:r/>
+      <w:proofErr w:type="gramEnd"/>
+      <w:r/>
+      <w:r/>
+      <w:r/>
+      <w:proofErr w:type="gramStart"/>
+      <w:r/>
+      <w:proofErr w:type="gramEnd"/>
+      <w:r/>
+      <w:r/>
+      <w:r/>
+      <w:proofErr w:type="gramStart"/>
+      <w:r/>
+      <w:proofErr w:type="gramEnd"/>
+      <w:r/>
+      <w:r/>
+    </w:p>
+    <w:p>
+      <w:r>
+        <w:t xml:space="preserve">A more ethically responsible approach would involve </w:t>
+      </w:r>
+      <w:r>
+        <w:t>prioritising</w:t>
+      </w:r>
+      <w:r>
+        <w:t xml:space="preserve"> algorithms that guarantee optimal routes such as </w:t>
+      </w:r>
+      <w:r>
+        <w:t xml:space="preserve">Dijkstra or A*. </w:t>
+      </w:r>
+      <w:r>
+        <w:t xml:space="preserve">DFS and BFS could be removed </w:t>
+      </w:r>
+      <w:r>
+        <w:t xml:space="preserve">entirely from application. </w:t>
+      </w:r>
+      <w:r>
+        <w:t>Additionally, a review</w:t>
+      </w:r>
+      <w:r>
+        <w:t xml:space="preserve"> into </w:t>
+      </w:r>
+      <w:r>
+        <w:t xml:space="preserve">the heuristic function could be conducted to identify </w:t>
+      </w:r>
+      <w:r>
+        <w:t>other more suitable o</w:t>
+      </w:r>
+      <w:r>
+        <w:t>ptions for the diversity of roads conditions.</w:t>
+      </w:r>
+    </w:p>
+    <w:p>
+      <w:r>
+        <w:t xml:space="preserve">Another option would be </w:t>
+      </w:r>
+      <w:r>
+        <w:t xml:space="preserve">to provide </w:t>
+      </w:r>
+      <w:r>
+        <w:t>transparency</w:t>
+      </w:r>
+      <w:r>
+        <w:t xml:space="preserve"> in how routes are generated. For example, the application could </w:t>
+      </w:r>
+      <w:r>
+        <w:t>label</w:t>
+      </w:r>
+      <w:r>
+        <w:t xml:space="preserve"> routes as ‘optimal’</w:t>
+      </w:r>
+      <w:r>
+        <w:t xml:space="preserve"> or ‘distance </w:t>
+      </w:r>
+      <w:r>
+        <w:t>heuristic</w:t>
+      </w:r>
+      <w:r>
+        <w:t xml:space="preserve"> based</w:t>
+      </w:r>
+      <w:r>
+        <w:t>’</w:t>
+      </w:r>
+      <w:r>
+        <w:t xml:space="preserve"> allowing th</w:t>
+      </w:r>
+      <w:r>
+        <w:t xml:space="preserve">e </w:t>
+      </w:r>
+      <w:r>
+        <w:t xml:space="preserve">user to understand the limits of each method. </w:t>
+      </w:r>
+      <w:r>
+        <w:t xml:space="preserve">While this solution is cheaper to implement compared to the first, from an ethical perspective prioritising accuracy and </w:t>
+      </w:r>
+      <w:r>
+        <w:t>transparency</w:t>
+      </w:r>
+      <w:r>
+        <w:t xml:space="preserve"> </w:t>
+      </w:r>
+      <w:r>
+        <w:t xml:space="preserve">outweighs the </w:t>
+      </w:r>
+      <w:r>
+        <w:t>potent</w:t>
+      </w:r>
+      <w:r>
+        <w:t xml:space="preserve">ial savings from implementing a solution that produces potentially misleading </w:t>
+      </w:r>
+      <w:r>
+        <w:t>or hard to interpret alternatives.</w:t>
+      </w:r>
+    </w:p>
+    <w:p>
+      <w:pPr>
+        <w:pStyle w:val="Heading2"/>
+      </w:pPr>
+      <w:r>
+        <w:t>Application</w:t>
+      </w:r>
+      <w:r>
+        <w:t xml:space="preserve"> Transparency and Data Quality</w:t>
+      </w:r>
+    </w:p>
+    <w:p>
+      <w:r>
+        <w:t>The TBRGS application relies on machine learning models trained on traffic data from October 2006. While this data gives a general basis for prediction, it is significantly outdated. Over the past two decades, changes have occurred to road infrastructure, population density, public transport and commuting patterns. As a result, predictions based on this data may not accurately reflect current traffic conditions. Floridi et al. (2018) identify honesty and accuracy as ethical obligations for AI systems — presenting predictions derived from outdated data without disclosure fails this standard.</w:t>
+      </w:r>
+      <w:r/>
+      <w:r/>
+      <w:r/>
+      <w:r/>
+      <w:r/>
+      <w:r/>
+      <w:r/>
+      <w:r/>
+      <w:r/>
+      <w:r/>
+      <w:r/>
+      <w:r/>
+      <w:r/>
+    </w:p>
+    <w:p>
+      <w:r>
+        <w:t>In addition to outdate</w:t>
+      </w:r>
+      <w:r>
+        <w:t>d</w:t>
+      </w:r>
+      <w:r>
+        <w:t xml:space="preserve"> data, the </w:t>
       </w:r>
       <w:r>
         <w:t>application</w:t>
       </w:r>
       <w:r>
-        <w:t xml:space="preserve"> assume that the recommended route is the most efficient or optimal</w:t>
-      </w:r>
-      <w:r>
-        <w:t>, however when algorithms lik</w:t>
-      </w:r>
-      <w:r>
-        <w:t xml:space="preserve">e </w:t>
-      </w:r>
-      <w:r>
-        <w:t xml:space="preserve">DFS, BFS and </w:t>
-      </w:r>
-      <w:r>
-        <w:t xml:space="preserve">GBFS are used the resulting route may be suboptimal </w:t>
-      </w:r>
-      <w:r>
-        <w:t xml:space="preserve">due to the </w:t>
+        <w:t xml:space="preserve"> use constants in its travel time </w:t>
+      </w:r>
+      <w:r>
+        <w:t>calculations</w:t>
+      </w:r>
+      <w:r>
+        <w:t xml:space="preserve">. </w:t>
+      </w:r>
+      <w:r>
+        <w:t>Specifically,</w:t>
+      </w:r>
+      <w:r>
+        <w:t xml:space="preserve"> it assumes </w:t>
+      </w:r>
+      <w:r>
+        <w:t>the fixed</w:t>
+      </w:r>
+      <w:r>
+        <w:t xml:space="preserve"> constant</w:t>
+      </w:r>
+      <w:r>
+        <w:t>s of a 60km/h speed limit and an intersection delay of 30 seconds per intersection.</w:t>
+      </w:r>
+      <w:r>
+        <w:t xml:space="preserve"> </w:t>
+      </w:r>
+      <w:r>
+        <w:t>However</w:t>
+      </w:r>
+      <w:r>
+        <w:t>,</w:t>
+      </w:r>
+      <w:r>
+        <w:t xml:space="preserve"> this does not accurately reflect reality,</w:t>
+      </w:r>
+      <w:r>
+        <w:t xml:space="preserve"> speed limits vary widely depending on location, ranging from 40 km/h in school zones to 100km/h </w:t>
+      </w:r>
+      <w:r>
+        <w:t>on highways. Intersection delays also var</w:t>
+      </w:r>
+      <w:r>
+        <w:t>y</w:t>
+      </w:r>
+      <w:r>
+        <w:t xml:space="preserve"> based on </w:t>
+      </w:r>
+      <w:r>
+        <w:t xml:space="preserve">the </w:t>
+      </w:r>
+      <w:r>
+        <w:t>time of day</w:t>
+      </w:r>
+      <w:r>
+        <w:t xml:space="preserve">, </w:t>
       </w:r>
       <w:proofErr w:type="gramStart"/>
       <w:r>
-        <w:t>searches</w:t>
+        <w:t>location</w:t>
       </w:r>
       <w:proofErr w:type="gramEnd"/>
       <w:r>
-        <w:t xml:space="preserve"> properties</w:t>
-      </w:r>
-      <w:r>
-        <w:t xml:space="preserve">. </w:t>
-      </w:r>
-    </w:p>
-    <w:p>
-      <w:r>
-        <w:t>Following</w:t>
-      </w:r>
-      <w:r>
-        <w:t xml:space="preserve"> </w:t>
-      </w:r>
-      <w:r>
-        <w:t xml:space="preserve">this line of thought, ethical concerns </w:t>
-      </w:r>
-      <w:proofErr w:type="gramStart"/>
-      <w:r>
-        <w:t>lies</w:t>
-      </w:r>
-      <w:proofErr w:type="gramEnd"/>
-      <w:r>
-        <w:t xml:space="preserve"> within the selection of</w:t>
-      </w:r>
-      <w:r>
-        <w:t xml:space="preserve"> the</w:t>
-      </w:r>
-      <w:r>
-        <w:t xml:space="preserve"> heuristic functions. The current system uses the </w:t>
-      </w:r>
-      <w:proofErr w:type="gramStart"/>
-      <w:r>
-        <w:t>straight line</w:t>
-      </w:r>
-      <w:proofErr w:type="gramEnd"/>
-      <w:r>
-        <w:t xml:space="preserve"> distance between intersections as a heuristic. While functional </w:t>
-      </w:r>
-      <w:r>
-        <w:t xml:space="preserve">and accurate for straight roads, </w:t>
-      </w:r>
-      <w:r>
-        <w:t xml:space="preserve">it suffers under curved roads or the sparse </w:t>
-      </w:r>
-      <w:proofErr w:type="gramStart"/>
-      <w:r>
-        <w:t>amount</w:t>
-      </w:r>
-      <w:proofErr w:type="gramEnd"/>
-      <w:r>
-        <w:t xml:space="preserve"> of intersections we have to work with.</w:t>
-      </w:r>
-      <w:r>
-        <w:t xml:space="preserve"> </w:t>
-      </w:r>
-    </w:p>
-    <w:p>
-      <w:r>
-        <w:t xml:space="preserve">A more ethically responsible approach would involve </w:t>
-      </w:r>
-      <w:r>
-        <w:t>prioritising</w:t>
-      </w:r>
-      <w:r>
-        <w:t xml:space="preserve"> algorithms that guarantee optimal routes such as </w:t>
-      </w:r>
-      <w:r>
-        <w:t xml:space="preserve">Dijkstra or A*. </w:t>
-      </w:r>
-      <w:r>
-        <w:t xml:space="preserve">DFS and BFS could be removed </w:t>
-      </w:r>
-      <w:r>
-        <w:t xml:space="preserve">entirely from application. </w:t>
-      </w:r>
-      <w:r>
-        <w:t>Additionally, a review</w:t>
-      </w:r>
-      <w:r>
-        <w:t xml:space="preserve"> into </w:t>
-      </w:r>
-      <w:r>
-        <w:t xml:space="preserve">the heuristic function could be conducted to identify </w:t>
-      </w:r>
-      <w:r>
-        <w:t>other more suitable o</w:t>
-      </w:r>
-      <w:r>
-        <w:t>ptions for the diversity of roads conditions.</w:t>
-      </w:r>
-    </w:p>
-    <w:p>
-      <w:r>
-        <w:t xml:space="preserve">Another option would be </w:t>
-      </w:r>
-      <w:r>
-        <w:t xml:space="preserve">to provide </w:t>
-      </w:r>
-      <w:r>
-        <w:t>transparency</w:t>
-      </w:r>
-      <w:r>
-        <w:t xml:space="preserve"> in how routes are generated. For example, the application could </w:t>
-      </w:r>
-      <w:r>
-        <w:t>label</w:t>
-      </w:r>
-      <w:r>
-        <w:t xml:space="preserve"> routes as ‘optimal’</w:t>
-      </w:r>
-      <w:r>
-        <w:t xml:space="preserve"> or ‘distance </w:t>
-      </w:r>
-      <w:r>
-        <w:t>heuristic</w:t>
-      </w:r>
-      <w:r>
-        <w:t xml:space="preserve"> based</w:t>
-      </w:r>
-      <w:r>
-        <w:t>’</w:t>
-      </w:r>
-      <w:r>
-        <w:t xml:space="preserve"> allowing th</w:t>
-      </w:r>
-      <w:r>
-        <w:t xml:space="preserve">e </w:t>
-      </w:r>
-      <w:r>
-        <w:t xml:space="preserve">user to understand the limits of each method. </w:t>
-      </w:r>
-      <w:r>
-        <w:t xml:space="preserve">While this solution is cheaper to implement compared to the first, from an ethical perspective prioritising accuracy and </w:t>
-      </w:r>
-      <w:r>
-        <w:t>transparency</w:t>
-      </w:r>
-      <w:r>
-        <w:t xml:space="preserve"> </w:t>
-      </w:r>
-      <w:r>
-        <w:t xml:space="preserve">outweighs the </w:t>
-      </w:r>
-      <w:r>
-        <w:t>potent</w:t>
-      </w:r>
-      <w:r>
-        <w:t xml:space="preserve">ial savings from implementing a solution that produces potentially misleading </w:t>
-      </w:r>
-      <w:r>
-        <w:t>or hard to interpret alternatives.</w:t>
-      </w:r>
-    </w:p>
-    <w:p>
-      <w:pPr>
-        <w:pStyle w:val="Heading2"/>
-      </w:pPr>
-      <w:r>
-        <w:t>Application</w:t>
-      </w:r>
-      <w:r>
-        <w:t xml:space="preserve"> Transparency and Data Quality</w:t>
-      </w:r>
-    </w:p>
-    <w:p>
-      <w:r>
-        <w:t xml:space="preserve">The TBRGS application relies on machine learning models trained on traffic data from October 2006. While this data </w:t>
-      </w:r>
-      <w:r>
-        <w:t>give</w:t>
-      </w:r>
-      <w:r>
-        <w:t>s</w:t>
-      </w:r>
-      <w:r>
-        <w:t xml:space="preserve"> a general </w:t>
-      </w:r>
-      <w:r>
-        <w:t>basis for prediction</w:t>
-      </w:r>
-      <w:r>
-        <w:t>,</w:t>
-      </w:r>
-      <w:r>
-        <w:t xml:space="preserve"> it</w:t>
-      </w:r>
-      <w:r>
-        <w:t>’s</w:t>
-      </w:r>
-      <w:r>
-        <w:t xml:space="preserve"> significantly outdated. </w:t>
-      </w:r>
-      <w:r>
-        <w:t xml:space="preserve">Over the past two decades </w:t>
-      </w:r>
-      <w:r>
-        <w:t xml:space="preserve">changes have </w:t>
-      </w:r>
-      <w:r>
-        <w:t>occurred</w:t>
-      </w:r>
-      <w:r>
-        <w:t xml:space="preserve"> to road infrastructure, </w:t>
-      </w:r>
-      <w:r>
-        <w:t>population density, public transport and commuting patterns. As a result, predictions based on this data may not accurately reflect the current traffic conditions.</w:t>
-      </w:r>
-    </w:p>
-    <w:p>
-      <w:r>
-        <w:t>In addition to outdate</w:t>
-      </w:r>
-      <w:r>
-        <w:t>d</w:t>
-      </w:r>
-      <w:r>
-        <w:t xml:space="preserve"> data, the </w:t>
-      </w:r>
-      <w:r>
-        <w:t>application</w:t>
-      </w:r>
-      <w:r>
-        <w:t xml:space="preserve"> use constants in its travel time </w:t>
-      </w:r>
-      <w:r>
-        <w:t>calculations</w:t>
-      </w:r>
-      <w:r>
-        <w:t xml:space="preserve">. </w:t>
-      </w:r>
-      <w:r>
-        <w:t>Specifically,</w:t>
-      </w:r>
-      <w:r>
-        <w:t xml:space="preserve"> it assumes </w:t>
-      </w:r>
-      <w:r>
-        <w:t>the fixed</w:t>
-      </w:r>
-      <w:r>
-        <w:t xml:space="preserve"> constant</w:t>
-      </w:r>
-      <w:r>
-        <w:t>s of a 60km/h speed limit and an intersection delay of 30 seconds per intersection.</w:t>
-      </w:r>
-      <w:r>
-        <w:t xml:space="preserve"> </w:t>
-      </w:r>
-      <w:r>
-        <w:t>However</w:t>
-      </w:r>
-      <w:r>
-        <w:t>,</w:t>
-      </w:r>
-      <w:r>
-        <w:t xml:space="preserve"> this does not accurately reflect reality,</w:t>
-      </w:r>
-      <w:r>
-        <w:t xml:space="preserve"> speed limits vary widely depending on location, ranging from 40 km/h in school zones to 100km/h </w:t>
-      </w:r>
-      <w:r>
-        <w:t>on highways. Intersection delays also var</w:t>
-      </w:r>
-      <w:r>
-        <w:t>y</w:t>
-      </w:r>
-      <w:r>
-        <w:t xml:space="preserve"> based on </w:t>
-      </w:r>
-      <w:r>
-        <w:t xml:space="preserve">the </w:t>
-      </w:r>
-      <w:r>
-        <w:t>time of day</w:t>
-      </w:r>
-      <w:r>
-        <w:t xml:space="preserve">, </w:t>
-      </w:r>
-      <w:proofErr w:type="gramStart"/>
-      <w:r>
-        <w:t>location</w:t>
-      </w:r>
-      <w:proofErr w:type="gramEnd"/>
-      <w:r>
         <w:t xml:space="preserve"> and traffic flow</w:t>
       </w:r>
       <w:r>
@@ -689,56 +529,24 @@
     </w:p>
     <w:p>
       <w:r>
-        <w:t xml:space="preserve">These simplifications </w:t>
-      </w:r>
-      <w:r>
-        <w:t>introduce</w:t>
-      </w:r>
-      <w:r>
-        <w:t xml:space="preserve"> inaccuracies </w:t>
-      </w:r>
-      <w:r>
-        <w:t>in route finding</w:t>
-      </w:r>
-      <w:r>
-        <w:t xml:space="preserve">, leading to travel time estimates that </w:t>
-      </w:r>
-      <w:r>
-        <w:t xml:space="preserve">do not reflect the </w:t>
-      </w:r>
-      <w:r>
-        <w:t>real world</w:t>
-      </w:r>
-      <w:r>
-        <w:t>s</w:t>
-      </w:r>
-      <w:r>
-        <w:t xml:space="preserve"> </w:t>
-      </w:r>
-      <w:r>
-        <w:t>condition</w:t>
-      </w:r>
-      <w:r>
-        <w:t>s</w:t>
-      </w:r>
-      <w:r>
-        <w:t xml:space="preserve">. The ethical concern </w:t>
-      </w:r>
-      <w:r>
-        <w:t>arises</w:t>
-      </w:r>
-      <w:r>
-        <w:t xml:space="preserve"> when these estimates are presented to users without ad</w:t>
-      </w:r>
-      <w:r>
-        <w:t>equate explanation. Users assume that predictions are accurate and up to date, leading to misplaced trust and</w:t>
-      </w:r>
-      <w:r>
-        <w:t xml:space="preserve"> consequently uniformed decision</w:t>
-      </w:r>
-      <w:r>
-        <w:t>.</w:t>
-      </w:r>
+        <w:t>These simplifications introduce inaccuracies in route finding, leading to travel time estimates that do not reflect real world conditions. The ethical concern arises when these estimates are presented to users without adequate explanation. Users assume that predictions are accurate and up to date, leading to misplaced trust and consequently uninformed decisions. Huang et al. (2020) note that interpretability techniques such as SHAP values can help surface which inputs most influence a model's predictions, enabling developers to communicate model limitations more honestly to users.</w:t>
+      </w:r>
+      <w:r/>
+      <w:r/>
+      <w:r/>
+      <w:r/>
+      <w:r/>
+      <w:r/>
+      <w:r/>
+      <w:r/>
+      <w:r/>
+      <w:r/>
+      <w:r/>
+      <w:r/>
+      <w:r/>
+      <w:r/>
+      <w:r/>
+      <w:r/>
     </w:p>
     <w:p>
       <w:r>
@@ -900,119 +708,71 @@
     </w:p>
     <w:p>
       <w:r>
-        <w:t>Location data is highly sensitive, as it can reveal</w:t>
-      </w:r>
-      <w:r>
-        <w:t xml:space="preserve"> a</w:t>
+        <w:t>Location data is highly sensitive, as it can reveal a person's routines and private information (Zuboff, 2019). Collecting and storing such data creates risks such as being a target for data breaches. These risks are particularly significant if the application stores historical location data or user profiles. Several key decisions need to be made regarding data handling: how much data should be collected, how long should data be retained, where should data be stored, and for what purposes is the data used.</w:t>
+      </w:r>
+      <w:r/>
+      <w:r/>
+      <w:r/>
+      <w:r/>
+      <w:r/>
+      <w:r/>
+      <w:r/>
+      <w:r/>
+      <w:r/>
+      <w:r/>
+      <w:r/>
+      <w:r/>
+      <w:r/>
+      <w:r/>
+      <w:r/>
+      <w:r/>
+      <w:r/>
+      <w:r/>
+      <w:r/>
+      <w:r/>
+      <w:r/>
+      <w:r/>
+      <w:r/>
+      <w:r/>
+    </w:p>
+    <w:p>
+      <w:r>
+        <w:t xml:space="preserve">A privacy first approach would </w:t>
+      </w:r>
+      <w:r>
+        <w:t>prioritise</w:t>
       </w:r>
       <w:r>
         <w:t xml:space="preserve"> </w:t>
       </w:r>
       <w:r>
-        <w:t>person’s</w:t>
-      </w:r>
-      <w:r>
-        <w:t xml:space="preserve"> routines and private information. Collecting and storing such data creates risks </w:t>
-      </w:r>
-      <w:r>
-        <w:t xml:space="preserve">such as being a target for </w:t>
-      </w:r>
-      <w:r>
-        <w:t>data breaches</w:t>
-      </w:r>
-      <w:r>
-        <w:t xml:space="preserve">. </w:t>
-      </w:r>
-      <w:r>
-        <w:t>These</w:t>
-      </w:r>
-      <w:r>
-        <w:t xml:space="preserve"> risks are </w:t>
-      </w:r>
-      <w:r>
-        <w:t>particularly</w:t>
-      </w:r>
-      <w:r>
-        <w:t xml:space="preserve"> significant i</w:t>
-      </w:r>
-      <w:r>
-        <w:t>f</w:t>
-      </w:r>
-      <w:r>
-        <w:t xml:space="preserve"> the </w:t>
-      </w:r>
-      <w:r>
-        <w:t>application</w:t>
-      </w:r>
-      <w:r>
-        <w:t xml:space="preserve"> stores historical location data or</w:t>
-      </w:r>
-      <w:r>
-        <w:t xml:space="preserve"> the</w:t>
+        <w:t>minimal</w:t>
+      </w:r>
+      <w:r>
+        <w:t xml:space="preserve"> data collection. For example, location data could be used </w:t>
+      </w:r>
+      <w:r>
+        <w:t xml:space="preserve">only in </w:t>
+      </w:r>
+      <w:r>
+        <w:t xml:space="preserve">real time to determine the </w:t>
+      </w:r>
+      <w:r>
+        <w:t>user’s</w:t>
+      </w:r>
+      <w:r>
+        <w:t xml:space="preserve"> current position. This approach </w:t>
+      </w:r>
+      <w:r>
+        <w:t>elim</w:t>
+      </w:r>
+      <w:r>
+        <w:t>inates</w:t>
       </w:r>
       <w:r>
         <w:t xml:space="preserve"> </w:t>
       </w:r>
       <w:r>
-        <w:t>users’</w:t>
-      </w:r>
-      <w:r>
-        <w:t xml:space="preserve"> profiles.</w:t>
-      </w:r>
-      <w:r>
-        <w:t xml:space="preserve"> </w:t>
-      </w:r>
-      <w:r>
-        <w:t xml:space="preserve">Several key </w:t>
-      </w:r>
-      <w:r>
-        <w:t>decisions</w:t>
-      </w:r>
-      <w:r>
-        <w:t xml:space="preserve"> need to be made regarding data handling. How much data should be collected, how long should data </w:t>
-      </w:r>
-      <w:r>
-        <w:t>be retained, where should data be stored and for what purposes is the data used for.</w:t>
-      </w:r>
-    </w:p>
-    <w:p>
-      <w:r>
-        <w:t xml:space="preserve">A privacy first approach would </w:t>
-      </w:r>
-      <w:r>
-        <w:t>prioritise</w:t>
-      </w:r>
-      <w:r>
-        <w:t xml:space="preserve"> </w:t>
-      </w:r>
-      <w:r>
-        <w:t>minimal</w:t>
-      </w:r>
-      <w:r>
-        <w:t xml:space="preserve"> data collection. For example, location data could be used </w:t>
-      </w:r>
-      <w:r>
-        <w:t xml:space="preserve">only in </w:t>
-      </w:r>
-      <w:r>
-        <w:t xml:space="preserve">real time to determine the </w:t>
-      </w:r>
-      <w:r>
-        <w:t>user’s</w:t>
-      </w:r>
-      <w:r>
-        <w:t xml:space="preserve"> current position. This approach </w:t>
-      </w:r>
-      <w:r>
-        <w:t>elim</w:t>
-      </w:r>
-      <w:r>
-        <w:t>inates</w:t>
-      </w:r>
-      <w:r>
-        <w:t xml:space="preserve"> </w:t>
-      </w:r>
-      <w:r>
         <w:t xml:space="preserve">risks associated with storing data </w:t>
       </w:r>
       <w:r>
@@ -1024,76 +784,32 @@
     </w:p>
     <w:p>
       <w:r>
-        <w:t xml:space="preserve">Another approach </w:t>
-      </w:r>
-      <w:r>
-        <w:t>could be</w:t>
-      </w:r>
-      <w:r>
-        <w:t xml:space="preserve"> implement</w:t>
-      </w:r>
-      <w:r>
-        <w:t>ing</w:t>
-      </w:r>
-      <w:r>
-        <w:t xml:space="preserve"> an opt in </w:t>
-      </w:r>
-      <w:r>
-        <w:t>design where</w:t>
-      </w:r>
-      <w:r>
-        <w:t xml:space="preserve"> users ca</w:t>
-      </w:r>
-      <w:r>
-        <w:t>n</w:t>
-      </w:r>
-      <w:r>
-        <w:t xml:space="preserve"> choose whether to enable data co</w:t>
-      </w:r>
-      <w:r>
-        <w:t xml:space="preserve">llection for </w:t>
-      </w:r>
-      <w:r>
-        <w:t xml:space="preserve">specific </w:t>
-      </w:r>
-      <w:r>
-        <w:t xml:space="preserve">features. </w:t>
-      </w:r>
-      <w:r>
-        <w:t>This aligns with legal requirements and gives the users control over their personal information.</w:t>
-      </w:r>
-      <w:r>
-        <w:t xml:space="preserve"> Additional measure could include, storing</w:t>
-      </w:r>
-      <w:r>
-        <w:t xml:space="preserve"> data locally on the </w:t>
-      </w:r>
-      <w:r>
-        <w:t>user’s</w:t>
-      </w:r>
-      <w:r>
-        <w:t xml:space="preserve"> device, providing clear policies and consent mechanism, allowing users </w:t>
-      </w:r>
-      <w:r>
-        <w:t xml:space="preserve">to delete their data at </w:t>
-      </w:r>
+        <w:t>Another approach could be implementing an opt in design where users can choose whether to enable data collection for specific features. This aligns with the requirements of the Privacy Act 1988 (Cth), which requires personal information to be collected only for a clearly stated purpose with the individual's informed consent (Office of the Australian Information Commissioner, 2023). Additional measures could include storing data locally on the user's device, providing clear policies and consent mechanisms, allowing users to delete their data at any time, and encrypting any data that is stored or transmitted. If TBRGS+ is made publicly available and likely to be accessed by children, the Privacy (Children's Online Privacy) Code 2026 (Exposure Draft) applies additional obligations, including a requirement to collect only information that is strictly necessary to provide the service by default (s.9) and specific notification requirements when tracking a user's geolocation (s.33) (Office of the Australian Information Commissioner, 2026).</w:t>
+      </w:r>
+      <w:r/>
+      <w:r/>
+      <w:r/>
+      <w:r/>
+      <w:r/>
+      <w:r/>
+      <w:r/>
+      <w:r/>
+      <w:r/>
+      <w:r/>
+      <w:r/>
+      <w:r/>
+      <w:r/>
+      <w:r/>
+      <w:r/>
+      <w:r/>
+      <w:r/>
       <w:proofErr w:type="spellStart"/>
-      <w:r>
-        <w:t>anytime</w:t>
-      </w:r>
+      <w:r/>
       <w:proofErr w:type="spellEnd"/>
-      <w:r>
-        <w:t xml:space="preserve"> and</w:t>
-      </w:r>
-      <w:r>
-        <w:t xml:space="preserve"> encrypting any </w:t>
-      </w:r>
-      <w:r>
-        <w:t>data that is stored or transmitted</w:t>
-      </w:r>
-      <w:r>
-        <w:t>.</w:t>
-      </w:r>
+      <w:r/>
+      <w:r/>
+      <w:r/>
+      <w:r/>
     </w:p>
     <w:p>
       <w:r>
@@ -1460,41 +1176,30 @@
           <w:b/>
           <w:bCs/>
         </w:rPr>
-        <w:t xml:space="preserve">Ensure Legal </w:t>
+        <w:t>Ensure Legal Compliance: Align data practices with the Privacy Act 1988 (Cth) (Office of the Australian Information Commissioner, 2023) and, if the application is accessible to minors, the Privacy (Children's Online Privacy) Code 2026 (Office of the Australian Information Commissioner, 2026).</w:t>
       </w:r>
       <w:r>
         <w:rPr>
           <w:b/>
           <w:bCs/>
         </w:rPr>
-        <w:t>C</w:t>
       </w:r>
       <w:r>
         <w:rPr>
           <w:b/>
           <w:bCs/>
         </w:rPr>
-        <w:t>omp</w:t>
       </w:r>
       <w:r>
         <w:rPr>
           <w:b/>
           <w:bCs/>
         </w:rPr>
-        <w:t>liance:</w:t>
-      </w:r>
-      <w:r>
-        <w:t xml:space="preserve"> Align data practices with the </w:t>
-      </w:r>
-      <w:r>
-        <w:t>Australian</w:t>
-      </w:r>
-      <w:r>
-        <w:t xml:space="preserve"> privacy act 1988</w:t>
-      </w:r>
-      <w:r>
-        <w:t>.</w:t>
-      </w:r>
+      </w:r>
+      <w:r/>
+      <w:r/>
+      <w:r/>
+      <w:r/>
     </w:p>
     <w:p>
       <w:r>

</xml_diff>